<commit_message>
Cap nhat bang dap an va bieu diem chi tiet cuoi trang file giao vien cho 3 de Hoa hoc 11 (De 01, De 02, De 03)
</commit_message>
<xml_diff>
--- a/San_Pham/De_Kiem_Tra_GK1_Hoa_11_De01_Ma101_GiaoVien.docx
+++ b/San_Pham/De_Kiem_Tra_GK1_Hoa_11_De01_Ma101_GiaoVien.docx
@@ -6539,6 +6539,1725 @@
         <w:t>---------- HẾT ----------</w:t>
       </w:r>
     </w:p>
+    <w:p>
+      <w:r>
+        <w:br w:type="page"/>
+      </w:r>
+    </w:p>
+    <w:p>
+      <w:pPr>
+        <w:spacing w:before="0" w:after="40"/>
+        <w:jc w:val="center"/>
+      </w:pPr>
+      <w:r>
+        <w:rPr>
+          <w:rFonts w:ascii="Times New Roman" w:hAnsi="Times New Roman"/>
+          <w:b/>
+          <w:color w:val="D32F2F"/>
+          <w:sz w:val="26"/>
+        </w:rPr>
+        <w:t>BẢNG ĐÁP ÁN VÀ BIỂU ĐIỂM CHI TIẾT – ĐỀ SỐ 01</w:t>
+      </w:r>
+    </w:p>
+    <w:p>
+      <w:pPr>
+        <w:spacing w:before="0" w:after="120"/>
+        <w:jc w:val="center"/>
+      </w:pPr>
+      <w:r>
+        <w:rPr>
+          <w:rFonts w:ascii="Times New Roman" w:hAnsi="Times New Roman"/>
+          <w:b/>
+          <w:color w:val="2E7D32"/>
+          <w:sz w:val="22"/>
+        </w:rPr>
+        <w:t>MÔN: HOÁ HỌC 11 – ĐỀ KIỂM TRA GIỮA HỌC KÌ I (MÃ ĐỀ: 101)</w:t>
+      </w:r>
+    </w:p>
+    <w:p>
+      <w:pPr>
+        <w:spacing w:before="0" w:after="120"/>
+        <w:pBdr>
+          <w:bottom w:val="single" w:sz="6" w:space="4" w:color="8BC390"/>
+        </w:pBdr>
+      </w:pPr>
+    </w:p>
+    <w:p>
+      <w:pPr>
+        <w:spacing w:before="80" w:after="40"/>
+      </w:pPr>
+      <w:r>
+        <w:rPr>
+          <w:rFonts w:ascii="Times New Roman" w:hAnsi="Times New Roman"/>
+          <w:b/>
+          <w:color w:val="2E7D32"/>
+          <w:sz w:val="22"/>
+        </w:rPr>
+        <w:t>1. PHẦN I – TRẮC NGHIỆM NHIỀU PHƯƠNG ÁN LỰA CHỌN (12 câu – 3,0 điểm; 0,25 đ/câu)</w:t>
+      </w:r>
+    </w:p>
+    <w:tbl>
+      <w:tblPr>
+        <w:tblW w:type="auto" w:w="0"/>
+        <w:jc w:val="center"/>
+        <w:tblLook w:firstColumn="1" w:firstRow="1" w:lastColumn="0" w:lastRow="0" w:noHBand="0" w:noVBand="1" w:val="04A0"/>
+        <w:tblBorders>
+          <w:top w:val="single" w:sz="4" w:space="0" w:color="8BC390"/>
+          <w:left w:val="single" w:sz="4" w:space="0" w:color="8BC390"/>
+          <w:bottom w:val="single" w:sz="4" w:space="0" w:color="8BC390"/>
+          <w:right w:val="single" w:sz="4" w:space="0" w:color="8BC390"/>
+          <w:insideH w:val="single" w:sz="4" w:space="0" w:color="8BC390"/>
+          <w:insideV w:val="single" w:sz="4" w:space="0" w:color="8BC390"/>
+        </w:tblBorders>
+      </w:tblPr>
+      <w:tblGrid>
+        <w:gridCol w:w="850"/>
+        <w:gridCol w:w="850"/>
+        <w:gridCol w:w="850"/>
+        <w:gridCol w:w="850"/>
+        <w:gridCol w:w="850"/>
+        <w:gridCol w:w="850"/>
+        <w:gridCol w:w="850"/>
+        <w:gridCol w:w="850"/>
+        <w:gridCol w:w="850"/>
+        <w:gridCol w:w="850"/>
+        <w:gridCol w:w="850"/>
+        <w:gridCol w:w="850"/>
+      </w:tblGrid>
+      <w:tr>
+        <w:tc>
+          <w:tcPr>
+            <w:tcW w:type="dxa" w:w="850"/>
+            <w:shd w:fill="E8F5E9"/>
+            <w:tcMar>
+              <w:top w:w="80" w:type="dxa"/>
+              <w:bottom w:w="80" w:type="dxa"/>
+              <w:left w:w="50" w:type="dxa"/>
+              <w:right w:w="50" w:type="dxa"/>
+            </w:tcMar>
+          </w:tcPr>
+          <w:p>
+            <w:pPr>
+              <w:spacing w:before="0" w:after="0"/>
+              <w:jc w:val="center"/>
+            </w:pPr>
+            <w:r>
+              <w:rPr>
+                <w:rFonts w:ascii="Times New Roman" w:hAnsi="Times New Roman"/>
+                <w:b/>
+                <w:sz w:val="19"/>
+              </w:rPr>
+              <w:t>Câu 1</w:t>
+            </w:r>
+          </w:p>
+        </w:tc>
+        <w:tc>
+          <w:tcPr>
+            <w:tcW w:type="dxa" w:w="850"/>
+            <w:shd w:fill="E8F5E9"/>
+            <w:tcMar>
+              <w:top w:w="80" w:type="dxa"/>
+              <w:bottom w:w="80" w:type="dxa"/>
+              <w:left w:w="50" w:type="dxa"/>
+              <w:right w:w="50" w:type="dxa"/>
+            </w:tcMar>
+          </w:tcPr>
+          <w:p>
+            <w:pPr>
+              <w:spacing w:before="0" w:after="0"/>
+              <w:jc w:val="center"/>
+            </w:pPr>
+            <w:r>
+              <w:rPr>
+                <w:rFonts w:ascii="Times New Roman" w:hAnsi="Times New Roman"/>
+                <w:b/>
+                <w:sz w:val="19"/>
+              </w:rPr>
+              <w:t>Câu 2</w:t>
+            </w:r>
+          </w:p>
+        </w:tc>
+        <w:tc>
+          <w:tcPr>
+            <w:tcW w:type="dxa" w:w="850"/>
+            <w:shd w:fill="E8F5E9"/>
+            <w:tcMar>
+              <w:top w:w="80" w:type="dxa"/>
+              <w:bottom w:w="80" w:type="dxa"/>
+              <w:left w:w="50" w:type="dxa"/>
+              <w:right w:w="50" w:type="dxa"/>
+            </w:tcMar>
+          </w:tcPr>
+          <w:p>
+            <w:pPr>
+              <w:spacing w:before="0" w:after="0"/>
+              <w:jc w:val="center"/>
+            </w:pPr>
+            <w:r>
+              <w:rPr>
+                <w:rFonts w:ascii="Times New Roman" w:hAnsi="Times New Roman"/>
+                <w:b/>
+                <w:sz w:val="19"/>
+              </w:rPr>
+              <w:t>Câu 3</w:t>
+            </w:r>
+          </w:p>
+        </w:tc>
+        <w:tc>
+          <w:tcPr>
+            <w:tcW w:type="dxa" w:w="850"/>
+            <w:shd w:fill="E8F5E9"/>
+            <w:tcMar>
+              <w:top w:w="80" w:type="dxa"/>
+              <w:bottom w:w="80" w:type="dxa"/>
+              <w:left w:w="50" w:type="dxa"/>
+              <w:right w:w="50" w:type="dxa"/>
+            </w:tcMar>
+          </w:tcPr>
+          <w:p>
+            <w:pPr>
+              <w:spacing w:before="0" w:after="0"/>
+              <w:jc w:val="center"/>
+            </w:pPr>
+            <w:r>
+              <w:rPr>
+                <w:rFonts w:ascii="Times New Roman" w:hAnsi="Times New Roman"/>
+                <w:b/>
+                <w:sz w:val="19"/>
+              </w:rPr>
+              <w:t>Câu 4</w:t>
+            </w:r>
+          </w:p>
+        </w:tc>
+        <w:tc>
+          <w:tcPr>
+            <w:tcW w:type="dxa" w:w="850"/>
+            <w:shd w:fill="E8F5E9"/>
+            <w:tcMar>
+              <w:top w:w="80" w:type="dxa"/>
+              <w:bottom w:w="80" w:type="dxa"/>
+              <w:left w:w="50" w:type="dxa"/>
+              <w:right w:w="50" w:type="dxa"/>
+            </w:tcMar>
+          </w:tcPr>
+          <w:p>
+            <w:pPr>
+              <w:spacing w:before="0" w:after="0"/>
+              <w:jc w:val="center"/>
+            </w:pPr>
+            <w:r>
+              <w:rPr>
+                <w:rFonts w:ascii="Times New Roman" w:hAnsi="Times New Roman"/>
+                <w:b/>
+                <w:sz w:val="19"/>
+              </w:rPr>
+              <w:t>Câu 5</w:t>
+            </w:r>
+          </w:p>
+        </w:tc>
+        <w:tc>
+          <w:tcPr>
+            <w:tcW w:type="dxa" w:w="850"/>
+            <w:shd w:fill="E8F5E9"/>
+            <w:tcMar>
+              <w:top w:w="80" w:type="dxa"/>
+              <w:bottom w:w="80" w:type="dxa"/>
+              <w:left w:w="50" w:type="dxa"/>
+              <w:right w:w="50" w:type="dxa"/>
+            </w:tcMar>
+          </w:tcPr>
+          <w:p>
+            <w:pPr>
+              <w:spacing w:before="0" w:after="0"/>
+              <w:jc w:val="center"/>
+            </w:pPr>
+            <w:r>
+              <w:rPr>
+                <w:rFonts w:ascii="Times New Roman" w:hAnsi="Times New Roman"/>
+                <w:b/>
+                <w:sz w:val="19"/>
+              </w:rPr>
+              <w:t>Câu 6</w:t>
+            </w:r>
+          </w:p>
+        </w:tc>
+        <w:tc>
+          <w:tcPr>
+            <w:tcW w:type="dxa" w:w="850"/>
+            <w:shd w:fill="E8F5E9"/>
+            <w:tcMar>
+              <w:top w:w="80" w:type="dxa"/>
+              <w:bottom w:w="80" w:type="dxa"/>
+              <w:left w:w="50" w:type="dxa"/>
+              <w:right w:w="50" w:type="dxa"/>
+            </w:tcMar>
+          </w:tcPr>
+          <w:p>
+            <w:pPr>
+              <w:spacing w:before="0" w:after="0"/>
+              <w:jc w:val="center"/>
+            </w:pPr>
+            <w:r>
+              <w:rPr>
+                <w:rFonts w:ascii="Times New Roman" w:hAnsi="Times New Roman"/>
+                <w:b/>
+                <w:sz w:val="19"/>
+              </w:rPr>
+              <w:t>Câu 7</w:t>
+            </w:r>
+          </w:p>
+        </w:tc>
+        <w:tc>
+          <w:tcPr>
+            <w:tcW w:type="dxa" w:w="850"/>
+            <w:shd w:fill="E8F5E9"/>
+            <w:tcMar>
+              <w:top w:w="80" w:type="dxa"/>
+              <w:bottom w:w="80" w:type="dxa"/>
+              <w:left w:w="50" w:type="dxa"/>
+              <w:right w:w="50" w:type="dxa"/>
+            </w:tcMar>
+          </w:tcPr>
+          <w:p>
+            <w:pPr>
+              <w:spacing w:before="0" w:after="0"/>
+              <w:jc w:val="center"/>
+            </w:pPr>
+            <w:r>
+              <w:rPr>
+                <w:rFonts w:ascii="Times New Roman" w:hAnsi="Times New Roman"/>
+                <w:b/>
+                <w:sz w:val="19"/>
+              </w:rPr>
+              <w:t>Câu 8</w:t>
+            </w:r>
+          </w:p>
+        </w:tc>
+        <w:tc>
+          <w:tcPr>
+            <w:tcW w:type="dxa" w:w="850"/>
+            <w:shd w:fill="E8F5E9"/>
+            <w:tcMar>
+              <w:top w:w="80" w:type="dxa"/>
+              <w:bottom w:w="80" w:type="dxa"/>
+              <w:left w:w="50" w:type="dxa"/>
+              <w:right w:w="50" w:type="dxa"/>
+            </w:tcMar>
+          </w:tcPr>
+          <w:p>
+            <w:pPr>
+              <w:spacing w:before="0" w:after="0"/>
+              <w:jc w:val="center"/>
+            </w:pPr>
+            <w:r>
+              <w:rPr>
+                <w:rFonts w:ascii="Times New Roman" w:hAnsi="Times New Roman"/>
+                <w:b/>
+                <w:sz w:val="19"/>
+              </w:rPr>
+              <w:t>Câu 9</w:t>
+            </w:r>
+          </w:p>
+        </w:tc>
+        <w:tc>
+          <w:tcPr>
+            <w:tcW w:type="dxa" w:w="850"/>
+            <w:shd w:fill="E8F5E9"/>
+            <w:tcMar>
+              <w:top w:w="80" w:type="dxa"/>
+              <w:bottom w:w="80" w:type="dxa"/>
+              <w:left w:w="50" w:type="dxa"/>
+              <w:right w:w="50" w:type="dxa"/>
+            </w:tcMar>
+          </w:tcPr>
+          <w:p>
+            <w:pPr>
+              <w:spacing w:before="0" w:after="0"/>
+              <w:jc w:val="center"/>
+            </w:pPr>
+            <w:r>
+              <w:rPr>
+                <w:rFonts w:ascii="Times New Roman" w:hAnsi="Times New Roman"/>
+                <w:b/>
+                <w:sz w:val="19"/>
+              </w:rPr>
+              <w:t>Câu 10</w:t>
+            </w:r>
+          </w:p>
+        </w:tc>
+        <w:tc>
+          <w:tcPr>
+            <w:tcW w:type="dxa" w:w="850"/>
+            <w:shd w:fill="E8F5E9"/>
+            <w:tcMar>
+              <w:top w:w="80" w:type="dxa"/>
+              <w:bottom w:w="80" w:type="dxa"/>
+              <w:left w:w="50" w:type="dxa"/>
+              <w:right w:w="50" w:type="dxa"/>
+            </w:tcMar>
+          </w:tcPr>
+          <w:p>
+            <w:pPr>
+              <w:spacing w:before="0" w:after="0"/>
+              <w:jc w:val="center"/>
+            </w:pPr>
+            <w:r>
+              <w:rPr>
+                <w:rFonts w:ascii="Times New Roman" w:hAnsi="Times New Roman"/>
+                <w:b/>
+                <w:sz w:val="19"/>
+              </w:rPr>
+              <w:t>Câu 11</w:t>
+            </w:r>
+          </w:p>
+        </w:tc>
+        <w:tc>
+          <w:tcPr>
+            <w:tcW w:type="dxa" w:w="850"/>
+            <w:shd w:fill="E8F5E9"/>
+            <w:tcMar>
+              <w:top w:w="80" w:type="dxa"/>
+              <w:bottom w:w="80" w:type="dxa"/>
+              <w:left w:w="50" w:type="dxa"/>
+              <w:right w:w="50" w:type="dxa"/>
+            </w:tcMar>
+          </w:tcPr>
+          <w:p>
+            <w:pPr>
+              <w:spacing w:before="0" w:after="0"/>
+              <w:jc w:val="center"/>
+            </w:pPr>
+            <w:r>
+              <w:rPr>
+                <w:rFonts w:ascii="Times New Roman" w:hAnsi="Times New Roman"/>
+                <w:b/>
+                <w:sz w:val="19"/>
+              </w:rPr>
+              <w:t>Câu 12</w:t>
+            </w:r>
+          </w:p>
+        </w:tc>
+      </w:tr>
+      <w:tr>
+        <w:tc>
+          <w:tcPr>
+            <w:tcW w:type="dxa" w:w="850"/>
+            <w:tcMar>
+              <w:top w:w="80" w:type="dxa"/>
+              <w:bottom w:w="80" w:type="dxa"/>
+              <w:left w:w="50" w:type="dxa"/>
+              <w:right w:w="50" w:type="dxa"/>
+            </w:tcMar>
+          </w:tcPr>
+          <w:p>
+            <w:pPr>
+              <w:spacing w:before="0" w:after="0"/>
+              <w:jc w:val="center"/>
+            </w:pPr>
+            <w:r>
+              <w:rPr>
+                <w:rFonts w:ascii="Times New Roman" w:hAnsi="Times New Roman"/>
+                <w:b/>
+                <w:color w:val="C62828"/>
+                <w:sz w:val="22"/>
+              </w:rPr>
+              <w:t>A</w:t>
+            </w:r>
+          </w:p>
+        </w:tc>
+        <w:tc>
+          <w:tcPr>
+            <w:tcW w:type="dxa" w:w="850"/>
+            <w:tcMar>
+              <w:top w:w="80" w:type="dxa"/>
+              <w:bottom w:w="80" w:type="dxa"/>
+              <w:left w:w="50" w:type="dxa"/>
+              <w:right w:w="50" w:type="dxa"/>
+            </w:tcMar>
+          </w:tcPr>
+          <w:p>
+            <w:pPr>
+              <w:spacing w:before="0" w:after="0"/>
+              <w:jc w:val="center"/>
+            </w:pPr>
+            <w:r>
+              <w:rPr>
+                <w:rFonts w:ascii="Times New Roman" w:hAnsi="Times New Roman"/>
+                <w:b/>
+                <w:color w:val="C62828"/>
+                <w:sz w:val="22"/>
+              </w:rPr>
+              <w:t>B</w:t>
+            </w:r>
+          </w:p>
+        </w:tc>
+        <w:tc>
+          <w:tcPr>
+            <w:tcW w:type="dxa" w:w="850"/>
+            <w:tcMar>
+              <w:top w:w="80" w:type="dxa"/>
+              <w:bottom w:w="80" w:type="dxa"/>
+              <w:left w:w="50" w:type="dxa"/>
+              <w:right w:w="50" w:type="dxa"/>
+            </w:tcMar>
+          </w:tcPr>
+          <w:p>
+            <w:pPr>
+              <w:spacing w:before="0" w:after="0"/>
+              <w:jc w:val="center"/>
+            </w:pPr>
+            <w:r>
+              <w:rPr>
+                <w:rFonts w:ascii="Times New Roman" w:hAnsi="Times New Roman"/>
+                <w:b/>
+                <w:color w:val="C62828"/>
+                <w:sz w:val="22"/>
+              </w:rPr>
+              <w:t>A</w:t>
+            </w:r>
+          </w:p>
+        </w:tc>
+        <w:tc>
+          <w:tcPr>
+            <w:tcW w:type="dxa" w:w="850"/>
+            <w:tcMar>
+              <w:top w:w="80" w:type="dxa"/>
+              <w:bottom w:w="80" w:type="dxa"/>
+              <w:left w:w="50" w:type="dxa"/>
+              <w:right w:w="50" w:type="dxa"/>
+            </w:tcMar>
+          </w:tcPr>
+          <w:p>
+            <w:pPr>
+              <w:spacing w:before="0" w:after="0"/>
+              <w:jc w:val="center"/>
+            </w:pPr>
+            <w:r>
+              <w:rPr>
+                <w:rFonts w:ascii="Times New Roman" w:hAnsi="Times New Roman"/>
+                <w:b/>
+                <w:color w:val="C62828"/>
+                <w:sz w:val="22"/>
+              </w:rPr>
+              <w:t>C</w:t>
+            </w:r>
+          </w:p>
+        </w:tc>
+        <w:tc>
+          <w:tcPr>
+            <w:tcW w:type="dxa" w:w="850"/>
+            <w:tcMar>
+              <w:top w:w="80" w:type="dxa"/>
+              <w:bottom w:w="80" w:type="dxa"/>
+              <w:left w:w="50" w:type="dxa"/>
+              <w:right w:w="50" w:type="dxa"/>
+            </w:tcMar>
+          </w:tcPr>
+          <w:p>
+            <w:pPr>
+              <w:spacing w:before="0" w:after="0"/>
+              <w:jc w:val="center"/>
+            </w:pPr>
+            <w:r>
+              <w:rPr>
+                <w:rFonts w:ascii="Times New Roman" w:hAnsi="Times New Roman"/>
+                <w:b/>
+                <w:color w:val="C62828"/>
+                <w:sz w:val="22"/>
+              </w:rPr>
+              <w:t>B</w:t>
+            </w:r>
+          </w:p>
+        </w:tc>
+        <w:tc>
+          <w:tcPr>
+            <w:tcW w:type="dxa" w:w="850"/>
+            <w:tcMar>
+              <w:top w:w="80" w:type="dxa"/>
+              <w:bottom w:w="80" w:type="dxa"/>
+              <w:left w:w="50" w:type="dxa"/>
+              <w:right w:w="50" w:type="dxa"/>
+            </w:tcMar>
+          </w:tcPr>
+          <w:p>
+            <w:pPr>
+              <w:spacing w:before="0" w:after="0"/>
+              <w:jc w:val="center"/>
+            </w:pPr>
+            <w:r>
+              <w:rPr>
+                <w:rFonts w:ascii="Times New Roman" w:hAnsi="Times New Roman"/>
+                <w:b/>
+                <w:color w:val="C62828"/>
+                <w:sz w:val="22"/>
+              </w:rPr>
+              <w:t>A</w:t>
+            </w:r>
+          </w:p>
+        </w:tc>
+        <w:tc>
+          <w:tcPr>
+            <w:tcW w:type="dxa" w:w="850"/>
+            <w:tcMar>
+              <w:top w:w="80" w:type="dxa"/>
+              <w:bottom w:w="80" w:type="dxa"/>
+              <w:left w:w="50" w:type="dxa"/>
+              <w:right w:w="50" w:type="dxa"/>
+            </w:tcMar>
+          </w:tcPr>
+          <w:p>
+            <w:pPr>
+              <w:spacing w:before="0" w:after="0"/>
+              <w:jc w:val="center"/>
+            </w:pPr>
+            <w:r>
+              <w:rPr>
+                <w:rFonts w:ascii="Times New Roman" w:hAnsi="Times New Roman"/>
+                <w:b/>
+                <w:color w:val="C62828"/>
+                <w:sz w:val="22"/>
+              </w:rPr>
+              <w:t>B</w:t>
+            </w:r>
+          </w:p>
+        </w:tc>
+        <w:tc>
+          <w:tcPr>
+            <w:tcW w:type="dxa" w:w="850"/>
+            <w:tcMar>
+              <w:top w:w="80" w:type="dxa"/>
+              <w:bottom w:w="80" w:type="dxa"/>
+              <w:left w:w="50" w:type="dxa"/>
+              <w:right w:w="50" w:type="dxa"/>
+            </w:tcMar>
+          </w:tcPr>
+          <w:p>
+            <w:pPr>
+              <w:spacing w:before="0" w:after="0"/>
+              <w:jc w:val="center"/>
+            </w:pPr>
+            <w:r>
+              <w:rPr>
+                <w:rFonts w:ascii="Times New Roman" w:hAnsi="Times New Roman"/>
+                <w:b/>
+                <w:color w:val="C62828"/>
+                <w:sz w:val="22"/>
+              </w:rPr>
+              <w:t>C</w:t>
+            </w:r>
+          </w:p>
+        </w:tc>
+        <w:tc>
+          <w:tcPr>
+            <w:tcW w:type="dxa" w:w="850"/>
+            <w:tcMar>
+              <w:top w:w="80" w:type="dxa"/>
+              <w:bottom w:w="80" w:type="dxa"/>
+              <w:left w:w="50" w:type="dxa"/>
+              <w:right w:w="50" w:type="dxa"/>
+            </w:tcMar>
+          </w:tcPr>
+          <w:p>
+            <w:pPr>
+              <w:spacing w:before="0" w:after="0"/>
+              <w:jc w:val="center"/>
+            </w:pPr>
+            <w:r>
+              <w:rPr>
+                <w:rFonts w:ascii="Times New Roman" w:hAnsi="Times New Roman"/>
+                <w:b/>
+                <w:color w:val="C62828"/>
+                <w:sz w:val="22"/>
+              </w:rPr>
+              <w:t>C</w:t>
+            </w:r>
+          </w:p>
+        </w:tc>
+        <w:tc>
+          <w:tcPr>
+            <w:tcW w:type="dxa" w:w="850"/>
+            <w:tcMar>
+              <w:top w:w="80" w:type="dxa"/>
+              <w:bottom w:w="80" w:type="dxa"/>
+              <w:left w:w="50" w:type="dxa"/>
+              <w:right w:w="50" w:type="dxa"/>
+            </w:tcMar>
+          </w:tcPr>
+          <w:p>
+            <w:pPr>
+              <w:spacing w:before="0" w:after="0"/>
+              <w:jc w:val="center"/>
+            </w:pPr>
+            <w:r>
+              <w:rPr>
+                <w:rFonts w:ascii="Times New Roman" w:hAnsi="Times New Roman"/>
+                <w:b/>
+                <w:color w:val="C62828"/>
+                <w:sz w:val="22"/>
+              </w:rPr>
+              <w:t>C</w:t>
+            </w:r>
+          </w:p>
+        </w:tc>
+        <w:tc>
+          <w:tcPr>
+            <w:tcW w:type="dxa" w:w="850"/>
+            <w:tcMar>
+              <w:top w:w="80" w:type="dxa"/>
+              <w:bottom w:w="80" w:type="dxa"/>
+              <w:left w:w="50" w:type="dxa"/>
+              <w:right w:w="50" w:type="dxa"/>
+            </w:tcMar>
+          </w:tcPr>
+          <w:p>
+            <w:pPr>
+              <w:spacing w:before="0" w:after="0"/>
+              <w:jc w:val="center"/>
+            </w:pPr>
+            <w:r>
+              <w:rPr>
+                <w:rFonts w:ascii="Times New Roman" w:hAnsi="Times New Roman"/>
+                <w:b/>
+                <w:color w:val="C62828"/>
+                <w:sz w:val="22"/>
+              </w:rPr>
+              <w:t>C</w:t>
+            </w:r>
+          </w:p>
+        </w:tc>
+        <w:tc>
+          <w:tcPr>
+            <w:tcW w:type="dxa" w:w="850"/>
+            <w:tcMar>
+              <w:top w:w="80" w:type="dxa"/>
+              <w:bottom w:w="80" w:type="dxa"/>
+              <w:left w:w="50" w:type="dxa"/>
+              <w:right w:w="50" w:type="dxa"/>
+            </w:tcMar>
+          </w:tcPr>
+          <w:p>
+            <w:pPr>
+              <w:spacing w:before="0" w:after="0"/>
+              <w:jc w:val="center"/>
+            </w:pPr>
+            <w:r>
+              <w:rPr>
+                <w:rFonts w:ascii="Times New Roman" w:hAnsi="Times New Roman"/>
+                <w:b/>
+                <w:color w:val="C62828"/>
+                <w:sz w:val="22"/>
+              </w:rPr>
+              <w:t>B</w:t>
+            </w:r>
+          </w:p>
+        </w:tc>
+      </w:tr>
+    </w:tbl>
+    <w:p>
+      <w:pPr>
+        <w:spacing w:before="160" w:after="40"/>
+      </w:pPr>
+      <w:r>
+        <w:rPr>
+          <w:rFonts w:ascii="Times New Roman" w:hAnsi="Times New Roman"/>
+          <w:b/>
+          <w:color w:val="2E7D32"/>
+          <w:sz w:val="22"/>
+        </w:rPr>
+        <w:t>2. PHẦN II – TRẮC NGHIỆM ĐÚNG / SAI (2 câu – 2,0 điểm)</w:t>
+      </w:r>
+    </w:p>
+    <w:p>
+      <w:pPr>
+        <w:spacing w:before="0" w:after="60"/>
+      </w:pPr>
+      <w:r>
+        <w:rPr>
+          <w:rFonts w:ascii="Times New Roman" w:hAnsi="Times New Roman"/>
+          <w:i/>
+          <w:sz w:val="19"/>
+        </w:rPr>
+        <w:t>*(Quy chế chấm: Thí sinh trả lời đúng 1 ý: 0,1 đ | Đúng 2 ý: 0,25 đ | Đúng 3 ý: 0,5 đ | Đúng cả 4 ý: 1,0 đ)*</w:t>
+      </w:r>
+    </w:p>
+    <w:tbl>
+      <w:tblPr>
+        <w:tblW w:type="auto" w:w="0"/>
+        <w:jc w:val="center"/>
+        <w:tblLook w:firstColumn="1" w:firstRow="1" w:lastColumn="0" w:lastRow="0" w:noHBand="0" w:noVBand="1" w:val="04A0"/>
+        <w:tblBorders>
+          <w:top w:val="single" w:sz="4" w:space="0" w:color="8BC390"/>
+          <w:left w:val="single" w:sz="4" w:space="0" w:color="8BC390"/>
+          <w:bottom w:val="single" w:sz="4" w:space="0" w:color="8BC390"/>
+          <w:right w:val="single" w:sz="4" w:space="0" w:color="8BC390"/>
+          <w:insideH w:val="single" w:sz="4" w:space="0" w:color="8BC390"/>
+          <w:insideV w:val="single" w:sz="4" w:space="0" w:color="8BC390"/>
+        </w:tblBorders>
+      </w:tblPr>
+      <w:tblGrid>
+        <w:gridCol w:w="2041"/>
+        <w:gridCol w:w="2041"/>
+        <w:gridCol w:w="2041"/>
+        <w:gridCol w:w="2041"/>
+        <w:gridCol w:w="2041"/>
+      </w:tblGrid>
+      <w:tr>
+        <w:tc>
+          <w:tcPr>
+            <w:tcW w:type="dxa" w:w="1701"/>
+            <w:shd w:fill="E8F5E9"/>
+            <w:tcMar>
+              <w:top w:w="80" w:type="dxa"/>
+              <w:bottom w:w="80" w:type="dxa"/>
+              <w:left w:w="100" w:type="dxa"/>
+              <w:right w:w="100" w:type="dxa"/>
+            </w:tcMar>
+          </w:tcPr>
+          <w:p>
+            <w:pPr>
+              <w:spacing w:before="0" w:after="0"/>
+              <w:jc w:val="center"/>
+            </w:pPr>
+            <w:r>
+              <w:rPr>
+                <w:rFonts w:ascii="Times New Roman" w:hAnsi="Times New Roman"/>
+                <w:b/>
+                <w:sz w:val="20"/>
+              </w:rPr>
+              <w:t>Câu hỏi</w:t>
+            </w:r>
+          </w:p>
+        </w:tc>
+        <w:tc>
+          <w:tcPr>
+            <w:tcW w:type="dxa" w:w="2126"/>
+            <w:shd w:fill="E8F5E9"/>
+            <w:tcMar>
+              <w:top w:w="80" w:type="dxa"/>
+              <w:bottom w:w="80" w:type="dxa"/>
+              <w:left w:w="100" w:type="dxa"/>
+              <w:right w:w="100" w:type="dxa"/>
+            </w:tcMar>
+          </w:tcPr>
+          <w:p>
+            <w:pPr>
+              <w:spacing w:before="0" w:after="0"/>
+              <w:jc w:val="center"/>
+            </w:pPr>
+            <w:r>
+              <w:rPr>
+                <w:rFonts w:ascii="Times New Roman" w:hAnsi="Times New Roman"/>
+                <w:b/>
+                <w:sz w:val="20"/>
+              </w:rPr>
+              <w:t>Lệnh hỏi a)</w:t>
+            </w:r>
+          </w:p>
+        </w:tc>
+        <w:tc>
+          <w:tcPr>
+            <w:tcW w:type="dxa" w:w="2126"/>
+            <w:shd w:fill="E8F5E9"/>
+            <w:tcMar>
+              <w:top w:w="80" w:type="dxa"/>
+              <w:bottom w:w="80" w:type="dxa"/>
+              <w:left w:w="100" w:type="dxa"/>
+              <w:right w:w="100" w:type="dxa"/>
+            </w:tcMar>
+          </w:tcPr>
+          <w:p>
+            <w:pPr>
+              <w:spacing w:before="0" w:after="0"/>
+              <w:jc w:val="center"/>
+            </w:pPr>
+            <w:r>
+              <w:rPr>
+                <w:rFonts w:ascii="Times New Roman" w:hAnsi="Times New Roman"/>
+                <w:b/>
+                <w:sz w:val="20"/>
+              </w:rPr>
+              <w:t>Lệnh hỏi b)</w:t>
+            </w:r>
+          </w:p>
+        </w:tc>
+        <w:tc>
+          <w:tcPr>
+            <w:tcW w:type="dxa" w:w="2126"/>
+            <w:shd w:fill="E8F5E9"/>
+            <w:tcMar>
+              <w:top w:w="80" w:type="dxa"/>
+              <w:bottom w:w="80" w:type="dxa"/>
+              <w:left w:w="100" w:type="dxa"/>
+              <w:right w:w="100" w:type="dxa"/>
+            </w:tcMar>
+          </w:tcPr>
+          <w:p>
+            <w:pPr>
+              <w:spacing w:before="0" w:after="0"/>
+              <w:jc w:val="center"/>
+            </w:pPr>
+            <w:r>
+              <w:rPr>
+                <w:rFonts w:ascii="Times New Roman" w:hAnsi="Times New Roman"/>
+                <w:b/>
+                <w:sz w:val="20"/>
+              </w:rPr>
+              <w:t>Lệnh hỏi c)</w:t>
+            </w:r>
+          </w:p>
+        </w:tc>
+        <w:tc>
+          <w:tcPr>
+            <w:tcW w:type="dxa" w:w="2126"/>
+            <w:shd w:fill="E8F5E9"/>
+            <w:tcMar>
+              <w:top w:w="80" w:type="dxa"/>
+              <w:bottom w:w="80" w:type="dxa"/>
+              <w:left w:w="100" w:type="dxa"/>
+              <w:right w:w="100" w:type="dxa"/>
+            </w:tcMar>
+          </w:tcPr>
+          <w:p>
+            <w:pPr>
+              <w:spacing w:before="0" w:after="0"/>
+              <w:jc w:val="center"/>
+            </w:pPr>
+            <w:r>
+              <w:rPr>
+                <w:rFonts w:ascii="Times New Roman" w:hAnsi="Times New Roman"/>
+                <w:b/>
+                <w:sz w:val="20"/>
+              </w:rPr>
+              <w:t>Lệnh hỏi d)</w:t>
+            </w:r>
+          </w:p>
+        </w:tc>
+      </w:tr>
+      <w:tr>
+        <w:tc>
+          <w:tcPr>
+            <w:tcW w:type="dxa" w:w="1701"/>
+            <w:tcMar>
+              <w:top w:w="80" w:type="dxa"/>
+              <w:bottom w:w="80" w:type="dxa"/>
+              <w:left w:w="100" w:type="dxa"/>
+              <w:right w:w="100" w:type="dxa"/>
+            </w:tcMar>
+          </w:tcPr>
+          <w:p>
+            <w:pPr>
+              <w:jc w:val="center"/>
+            </w:pPr>
+            <w:r>
+              <w:rPr>
+                <w:rFonts w:ascii="Times New Roman" w:hAnsi="Times New Roman"/>
+                <w:b/>
+                <w:sz w:val="20"/>
+              </w:rPr>
+              <w:t>Câu 13</w:t>
+            </w:r>
+          </w:p>
+        </w:tc>
+        <w:tc>
+          <w:tcPr>
+            <w:tcW w:type="dxa" w:w="2126"/>
+            <w:tcMar>
+              <w:top w:w="80" w:type="dxa"/>
+              <w:bottom w:w="80" w:type="dxa"/>
+              <w:left w:w="100" w:type="dxa"/>
+              <w:right w:w="100" w:type="dxa"/>
+            </w:tcMar>
+          </w:tcPr>
+          <w:p>
+            <w:pPr>
+              <w:jc w:val="center"/>
+            </w:pPr>
+            <w:r>
+              <w:rPr>
+                <w:rFonts w:ascii="Times New Roman" w:hAnsi="Times New Roman"/>
+                <w:b/>
+                <w:color w:val="C62828"/>
+                <w:sz w:val="20"/>
+              </w:rPr>
+              <w:t>ĐÚNG</w:t>
+            </w:r>
+          </w:p>
+        </w:tc>
+        <w:tc>
+          <w:tcPr>
+            <w:tcW w:type="dxa" w:w="2126"/>
+            <w:tcMar>
+              <w:top w:w="80" w:type="dxa"/>
+              <w:bottom w:w="80" w:type="dxa"/>
+              <w:left w:w="100" w:type="dxa"/>
+              <w:right w:w="100" w:type="dxa"/>
+            </w:tcMar>
+          </w:tcPr>
+          <w:p>
+            <w:pPr>
+              <w:jc w:val="center"/>
+            </w:pPr>
+            <w:r>
+              <w:rPr>
+                <w:rFonts w:ascii="Times New Roman" w:hAnsi="Times New Roman"/>
+                <w:b/>
+                <w:color w:val="2E7D32"/>
+                <w:sz w:val="20"/>
+              </w:rPr>
+              <w:t>SAI</w:t>
+            </w:r>
+          </w:p>
+        </w:tc>
+        <w:tc>
+          <w:tcPr>
+            <w:tcW w:type="dxa" w:w="2126"/>
+            <w:tcMar>
+              <w:top w:w="80" w:type="dxa"/>
+              <w:bottom w:w="80" w:type="dxa"/>
+              <w:left w:w="100" w:type="dxa"/>
+              <w:right w:w="100" w:type="dxa"/>
+            </w:tcMar>
+          </w:tcPr>
+          <w:p>
+            <w:pPr>
+              <w:jc w:val="center"/>
+            </w:pPr>
+            <w:r>
+              <w:rPr>
+                <w:rFonts w:ascii="Times New Roman" w:hAnsi="Times New Roman"/>
+                <w:b/>
+                <w:color w:val="2E7D32"/>
+                <w:sz w:val="20"/>
+              </w:rPr>
+              <w:t>SAI</w:t>
+            </w:r>
+          </w:p>
+        </w:tc>
+        <w:tc>
+          <w:tcPr>
+            <w:tcW w:type="dxa" w:w="2126"/>
+            <w:tcMar>
+              <w:top w:w="80" w:type="dxa"/>
+              <w:bottom w:w="80" w:type="dxa"/>
+              <w:left w:w="100" w:type="dxa"/>
+              <w:right w:w="100" w:type="dxa"/>
+            </w:tcMar>
+          </w:tcPr>
+          <w:p>
+            <w:pPr>
+              <w:jc w:val="center"/>
+            </w:pPr>
+            <w:r>
+              <w:rPr>
+                <w:rFonts w:ascii="Times New Roman" w:hAnsi="Times New Roman"/>
+                <w:b/>
+                <w:color w:val="C62828"/>
+                <w:sz w:val="20"/>
+              </w:rPr>
+              <w:t>ĐÚNG</w:t>
+            </w:r>
+          </w:p>
+        </w:tc>
+      </w:tr>
+      <w:tr>
+        <w:tc>
+          <w:tcPr>
+            <w:tcW w:type="dxa" w:w="1701"/>
+            <w:tcMar>
+              <w:top w:w="80" w:type="dxa"/>
+              <w:bottom w:w="80" w:type="dxa"/>
+              <w:left w:w="100" w:type="dxa"/>
+              <w:right w:w="100" w:type="dxa"/>
+            </w:tcMar>
+          </w:tcPr>
+          <w:p>
+            <w:pPr>
+              <w:jc w:val="center"/>
+            </w:pPr>
+            <w:r>
+              <w:rPr>
+                <w:rFonts w:ascii="Times New Roman" w:hAnsi="Times New Roman"/>
+                <w:b/>
+                <w:sz w:val="20"/>
+              </w:rPr>
+              <w:t>Câu 14</w:t>
+            </w:r>
+          </w:p>
+        </w:tc>
+        <w:tc>
+          <w:tcPr>
+            <w:tcW w:type="dxa" w:w="2126"/>
+            <w:tcMar>
+              <w:top w:w="80" w:type="dxa"/>
+              <w:bottom w:w="80" w:type="dxa"/>
+              <w:left w:w="100" w:type="dxa"/>
+              <w:right w:w="100" w:type="dxa"/>
+            </w:tcMar>
+          </w:tcPr>
+          <w:p>
+            <w:pPr>
+              <w:jc w:val="center"/>
+            </w:pPr>
+            <w:r>
+              <w:rPr>
+                <w:rFonts w:ascii="Times New Roman" w:hAnsi="Times New Roman"/>
+                <w:b/>
+                <w:color w:val="C62828"/>
+                <w:sz w:val="20"/>
+              </w:rPr>
+              <w:t>ĐÚNG</w:t>
+            </w:r>
+          </w:p>
+        </w:tc>
+        <w:tc>
+          <w:tcPr>
+            <w:tcW w:type="dxa" w:w="2126"/>
+            <w:tcMar>
+              <w:top w:w="80" w:type="dxa"/>
+              <w:bottom w:w="80" w:type="dxa"/>
+              <w:left w:w="100" w:type="dxa"/>
+              <w:right w:w="100" w:type="dxa"/>
+            </w:tcMar>
+          </w:tcPr>
+          <w:p>
+            <w:pPr>
+              <w:jc w:val="center"/>
+            </w:pPr>
+            <w:r>
+              <w:rPr>
+                <w:rFonts w:ascii="Times New Roman" w:hAnsi="Times New Roman"/>
+                <w:b/>
+                <w:color w:val="2E7D32"/>
+                <w:sz w:val="20"/>
+              </w:rPr>
+              <w:t>SAI</w:t>
+            </w:r>
+          </w:p>
+        </w:tc>
+        <w:tc>
+          <w:tcPr>
+            <w:tcW w:type="dxa" w:w="2126"/>
+            <w:tcMar>
+              <w:top w:w="80" w:type="dxa"/>
+              <w:bottom w:w="80" w:type="dxa"/>
+              <w:left w:w="100" w:type="dxa"/>
+              <w:right w:w="100" w:type="dxa"/>
+            </w:tcMar>
+          </w:tcPr>
+          <w:p>
+            <w:pPr>
+              <w:jc w:val="center"/>
+            </w:pPr>
+            <w:r>
+              <w:rPr>
+                <w:rFonts w:ascii="Times New Roman" w:hAnsi="Times New Roman"/>
+                <w:b/>
+                <w:color w:val="C62828"/>
+                <w:sz w:val="20"/>
+              </w:rPr>
+              <w:t>ĐÚNG</w:t>
+            </w:r>
+          </w:p>
+        </w:tc>
+        <w:tc>
+          <w:tcPr>
+            <w:tcW w:type="dxa" w:w="2126"/>
+            <w:tcMar>
+              <w:top w:w="80" w:type="dxa"/>
+              <w:bottom w:w="80" w:type="dxa"/>
+              <w:left w:w="100" w:type="dxa"/>
+              <w:right w:w="100" w:type="dxa"/>
+            </w:tcMar>
+          </w:tcPr>
+          <w:p>
+            <w:pPr>
+              <w:jc w:val="center"/>
+            </w:pPr>
+            <w:r>
+              <w:rPr>
+                <w:rFonts w:ascii="Times New Roman" w:hAnsi="Times New Roman"/>
+                <w:b/>
+                <w:color w:val="2E7D32"/>
+                <w:sz w:val="20"/>
+              </w:rPr>
+              <w:t>SAI</w:t>
+            </w:r>
+          </w:p>
+        </w:tc>
+      </w:tr>
+    </w:tbl>
+    <w:p>
+      <w:pPr>
+        <w:spacing w:before="160" w:after="40"/>
+      </w:pPr>
+      <w:r>
+        <w:rPr>
+          <w:rFonts w:ascii="Times New Roman" w:hAnsi="Times New Roman"/>
+          <w:b/>
+          <w:color w:val="2E7D32"/>
+          <w:sz w:val="22"/>
+        </w:rPr>
+        <w:t>3. PHẦN III – TRẮC NGHIỆM TRẢ LỜI NGẮN (4 câu – 2,0 điểm; 0,5 đ/câu)</w:t>
+      </w:r>
+    </w:p>
+    <w:tbl>
+      <w:tblPr>
+        <w:tblW w:type="auto" w:w="0"/>
+        <w:jc w:val="center"/>
+        <w:tblLook w:firstColumn="1" w:firstRow="1" w:lastColumn="0" w:lastRow="0" w:noHBand="0" w:noVBand="1" w:val="04A0"/>
+        <w:tblBorders>
+          <w:top w:val="single" w:sz="4" w:space="0" w:color="8BC390"/>
+          <w:left w:val="single" w:sz="4" w:space="0" w:color="8BC390"/>
+          <w:bottom w:val="single" w:sz="4" w:space="0" w:color="8BC390"/>
+          <w:right w:val="single" w:sz="4" w:space="0" w:color="8BC390"/>
+          <w:insideH w:val="single" w:sz="4" w:space="0" w:color="8BC390"/>
+          <w:insideV w:val="single" w:sz="4" w:space="0" w:color="8BC390"/>
+        </w:tblBorders>
+      </w:tblPr>
+      <w:tblGrid>
+        <w:gridCol w:w="2551"/>
+        <w:gridCol w:w="2551"/>
+        <w:gridCol w:w="2551"/>
+        <w:gridCol w:w="2551"/>
+      </w:tblGrid>
+      <w:tr>
+        <w:tc>
+          <w:tcPr>
+            <w:tcW w:type="dxa" w:w="2551"/>
+            <w:shd w:fill="E8F5E9"/>
+            <w:tcMar>
+              <w:top w:w="80" w:type="dxa"/>
+              <w:bottom w:w="80" w:type="dxa"/>
+              <w:left w:w="100" w:type="dxa"/>
+              <w:right w:w="100" w:type="dxa"/>
+            </w:tcMar>
+          </w:tcPr>
+          <w:p>
+            <w:pPr>
+              <w:jc w:val="center"/>
+            </w:pPr>
+            <w:r>
+              <w:rPr>
+                <w:rFonts w:ascii="Times New Roman" w:hAnsi="Times New Roman"/>
+                <w:b/>
+                <w:sz w:val="20"/>
+              </w:rPr>
+              <w:t>Câu 15</w:t>
+            </w:r>
+          </w:p>
+        </w:tc>
+        <w:tc>
+          <w:tcPr>
+            <w:tcW w:type="dxa" w:w="2551"/>
+            <w:shd w:fill="E8F5E9"/>
+            <w:tcMar>
+              <w:top w:w="80" w:type="dxa"/>
+              <w:bottom w:w="80" w:type="dxa"/>
+              <w:left w:w="100" w:type="dxa"/>
+              <w:right w:w="100" w:type="dxa"/>
+            </w:tcMar>
+          </w:tcPr>
+          <w:p>
+            <w:pPr>
+              <w:jc w:val="center"/>
+            </w:pPr>
+            <w:r>
+              <w:rPr>
+                <w:rFonts w:ascii="Times New Roman" w:hAnsi="Times New Roman"/>
+                <w:b/>
+                <w:sz w:val="20"/>
+              </w:rPr>
+              <w:t>Câu 16</w:t>
+            </w:r>
+          </w:p>
+        </w:tc>
+        <w:tc>
+          <w:tcPr>
+            <w:tcW w:type="dxa" w:w="2551"/>
+            <w:shd w:fill="E8F5E9"/>
+            <w:tcMar>
+              <w:top w:w="80" w:type="dxa"/>
+              <w:bottom w:w="80" w:type="dxa"/>
+              <w:left w:w="100" w:type="dxa"/>
+              <w:right w:w="100" w:type="dxa"/>
+            </w:tcMar>
+          </w:tcPr>
+          <w:p>
+            <w:pPr>
+              <w:jc w:val="center"/>
+            </w:pPr>
+            <w:r>
+              <w:rPr>
+                <w:rFonts w:ascii="Times New Roman" w:hAnsi="Times New Roman"/>
+                <w:b/>
+                <w:sz w:val="20"/>
+              </w:rPr>
+              <w:t>Câu 17</w:t>
+            </w:r>
+          </w:p>
+        </w:tc>
+        <w:tc>
+          <w:tcPr>
+            <w:tcW w:type="dxa" w:w="2551"/>
+            <w:shd w:fill="E8F5E9"/>
+            <w:tcMar>
+              <w:top w:w="80" w:type="dxa"/>
+              <w:bottom w:w="80" w:type="dxa"/>
+              <w:left w:w="100" w:type="dxa"/>
+              <w:right w:w="100" w:type="dxa"/>
+            </w:tcMar>
+          </w:tcPr>
+          <w:p>
+            <w:pPr>
+              <w:jc w:val="center"/>
+            </w:pPr>
+            <w:r>
+              <w:rPr>
+                <w:rFonts w:ascii="Times New Roman" w:hAnsi="Times New Roman"/>
+                <w:b/>
+                <w:sz w:val="20"/>
+              </w:rPr>
+              <w:t>Câu 18</w:t>
+            </w:r>
+          </w:p>
+        </w:tc>
+      </w:tr>
+      <w:tr>
+        <w:tc>
+          <w:tcPr>
+            <w:tcW w:type="dxa" w:w="2551"/>
+            <w:tcMar>
+              <w:top w:w="80" w:type="dxa"/>
+              <w:bottom w:w="80" w:type="dxa"/>
+              <w:left w:w="100" w:type="dxa"/>
+              <w:right w:w="100" w:type="dxa"/>
+            </w:tcMar>
+          </w:tcPr>
+          <w:p>
+            <w:pPr>
+              <w:jc w:val="center"/>
+            </w:pPr>
+            <w:r>
+              <w:rPr>
+                <w:rFonts w:ascii="Times New Roman" w:hAnsi="Times New Roman"/>
+                <w:b/>
+                <w:color w:val="C62828"/>
+                <w:sz w:val="22"/>
+              </w:rPr>
+              <w:t>3</w:t>
+            </w:r>
+          </w:p>
+        </w:tc>
+        <w:tc>
+          <w:tcPr>
+            <w:tcW w:type="dxa" w:w="2551"/>
+            <w:tcMar>
+              <w:top w:w="80" w:type="dxa"/>
+              <w:bottom w:w="80" w:type="dxa"/>
+              <w:left w:w="100" w:type="dxa"/>
+              <w:right w:w="100" w:type="dxa"/>
+            </w:tcMar>
+          </w:tcPr>
+          <w:p>
+            <w:pPr>
+              <w:jc w:val="center"/>
+            </w:pPr>
+            <w:r>
+              <w:rPr>
+                <w:rFonts w:ascii="Times New Roman" w:hAnsi="Times New Roman"/>
+                <w:b/>
+                <w:color w:val="C62828"/>
+                <w:sz w:val="22"/>
+              </w:rPr>
+              <w:t>1</w:t>
+            </w:r>
+          </w:p>
+        </w:tc>
+        <w:tc>
+          <w:tcPr>
+            <w:tcW w:type="dxa" w:w="2551"/>
+            <w:tcMar>
+              <w:top w:w="80" w:type="dxa"/>
+              <w:bottom w:w="80" w:type="dxa"/>
+              <w:left w:w="100" w:type="dxa"/>
+              <w:right w:w="100" w:type="dxa"/>
+            </w:tcMar>
+          </w:tcPr>
+          <w:p>
+            <w:pPr>
+              <w:jc w:val="center"/>
+            </w:pPr>
+            <w:r>
+              <w:rPr>
+                <w:rFonts w:ascii="Times New Roman" w:hAnsi="Times New Roman"/>
+                <w:b/>
+                <w:color w:val="C62828"/>
+                <w:sz w:val="22"/>
+              </w:rPr>
+              <w:t>3</w:t>
+            </w:r>
+          </w:p>
+        </w:tc>
+        <w:tc>
+          <w:tcPr>
+            <w:tcW w:type="dxa" w:w="2551"/>
+            <w:tcMar>
+              <w:top w:w="80" w:type="dxa"/>
+              <w:bottom w:w="80" w:type="dxa"/>
+              <w:left w:w="100" w:type="dxa"/>
+              <w:right w:w="100" w:type="dxa"/>
+            </w:tcMar>
+          </w:tcPr>
+          <w:p>
+            <w:pPr>
+              <w:jc w:val="center"/>
+            </w:pPr>
+            <w:r>
+              <w:rPr>
+                <w:rFonts w:ascii="Times New Roman" w:hAnsi="Times New Roman"/>
+                <w:b/>
+                <w:color w:val="C62828"/>
+                <w:sz w:val="22"/>
+              </w:rPr>
+              <w:t>3</w:t>
+            </w:r>
+          </w:p>
+        </w:tc>
+      </w:tr>
+    </w:tbl>
+    <w:p>
+      <w:pPr>
+        <w:spacing w:before="160" w:after="40"/>
+      </w:pPr>
+      <w:r>
+        <w:rPr>
+          <w:rFonts w:ascii="Times New Roman" w:hAnsi="Times New Roman"/>
+          <w:b/>
+          <w:color w:val="2E7D32"/>
+          <w:sz w:val="22"/>
+        </w:rPr>
+        <w:t>4. PHẦN IV – HƯỚNG DẪN CHẤM &amp; BIỂU ĐIỂM TỰ LUẬN (3 câu – 3,0 điểm)</w:t>
+      </w:r>
+    </w:p>
+    <w:tbl>
+      <w:tblPr>
+        <w:tblW w:type="auto" w:w="0"/>
+        <w:jc w:val="center"/>
+        <w:tblLook w:firstColumn="1" w:firstRow="1" w:lastColumn="0" w:lastRow="0" w:noHBand="0" w:noVBand="1" w:val="04A0"/>
+        <w:tblBorders>
+          <w:top w:val="single" w:sz="4" w:space="0" w:color="8BC390"/>
+          <w:left w:val="single" w:sz="4" w:space="0" w:color="8BC390"/>
+          <w:bottom w:val="single" w:sz="4" w:space="0" w:color="8BC390"/>
+          <w:right w:val="single" w:sz="4" w:space="0" w:color="8BC390"/>
+          <w:insideH w:val="single" w:sz="4" w:space="0" w:color="8BC390"/>
+          <w:insideV w:val="single" w:sz="4" w:space="0" w:color="8BC390"/>
+        </w:tblBorders>
+      </w:tblPr>
+      <w:tblGrid>
+        <w:gridCol w:w="3402"/>
+        <w:gridCol w:w="3402"/>
+        <w:gridCol w:w="3402"/>
+      </w:tblGrid>
+      <w:tr>
+        <w:tc>
+          <w:tcPr>
+            <w:tcW w:type="dxa" w:w="1247"/>
+            <w:shd w:fill="E8F5E9"/>
+            <w:tcMar>
+              <w:top w:w="80" w:type="dxa"/>
+              <w:bottom w:w="80" w:type="dxa"/>
+              <w:left w:w="100" w:type="dxa"/>
+              <w:right w:w="100" w:type="dxa"/>
+            </w:tcMar>
+          </w:tcPr>
+          <w:p>
+            <w:pPr>
+              <w:jc w:val="center"/>
+            </w:pPr>
+            <w:r>
+              <w:rPr>
+                <w:rFonts w:ascii="Times New Roman" w:hAnsi="Times New Roman"/>
+                <w:b/>
+                <w:sz w:val="20"/>
+              </w:rPr>
+              <w:t>Câu</w:t>
+            </w:r>
+          </w:p>
+        </w:tc>
+        <w:tc>
+          <w:tcPr>
+            <w:tcW w:type="dxa" w:w="7937"/>
+            <w:shd w:fill="E8F5E9"/>
+            <w:tcMar>
+              <w:top w:w="80" w:type="dxa"/>
+              <w:bottom w:w="80" w:type="dxa"/>
+              <w:left w:w="100" w:type="dxa"/>
+              <w:right w:w="100" w:type="dxa"/>
+            </w:tcMar>
+          </w:tcPr>
+          <w:p>
+            <w:pPr>
+              <w:jc w:val="center"/>
+            </w:pPr>
+            <w:r>
+              <w:rPr>
+                <w:rFonts w:ascii="Times New Roman" w:hAnsi="Times New Roman"/>
+                <w:b/>
+                <w:sz w:val="20"/>
+              </w:rPr>
+              <w:t>Nội dung yêu cầu &amp; Đáp số chuẩn</w:t>
+            </w:r>
+          </w:p>
+        </w:tc>
+        <w:tc>
+          <w:tcPr>
+            <w:tcW w:type="dxa" w:w="1020"/>
+            <w:shd w:fill="E8F5E9"/>
+            <w:tcMar>
+              <w:top w:w="80" w:type="dxa"/>
+              <w:bottom w:w="80" w:type="dxa"/>
+              <w:left w:w="100" w:type="dxa"/>
+              <w:right w:w="100" w:type="dxa"/>
+            </w:tcMar>
+          </w:tcPr>
+          <w:p>
+            <w:pPr>
+              <w:jc w:val="center"/>
+            </w:pPr>
+            <w:r>
+              <w:rPr>
+                <w:rFonts w:ascii="Times New Roman" w:hAnsi="Times New Roman"/>
+                <w:b/>
+                <w:sz w:val="20"/>
+              </w:rPr>
+              <w:t>Điểm</w:t>
+            </w:r>
+          </w:p>
+        </w:tc>
+      </w:tr>
+      <w:tr>
+        <w:tc>
+          <w:tcPr>
+            <w:tcW w:type="dxa" w:w="1247"/>
+            <w:tcMar>
+              <w:top w:w="80" w:type="dxa"/>
+              <w:bottom w:w="80" w:type="dxa"/>
+              <w:left w:w="100" w:type="dxa"/>
+              <w:right w:w="100" w:type="dxa"/>
+            </w:tcMar>
+          </w:tcPr>
+          <w:p>
+            <w:pPr>
+              <w:jc w:val="center"/>
+            </w:pPr>
+            <w:r>
+              <w:rPr>
+                <w:rFonts w:ascii="Times New Roman" w:hAnsi="Times New Roman"/>
+                <w:b/>
+                <w:sz w:val="20"/>
+              </w:rPr>
+              <w:t>Câu 19</w:t>
+            </w:r>
+          </w:p>
+        </w:tc>
+        <w:tc>
+          <w:tcPr>
+            <w:tcW w:type="dxa" w:w="7937"/>
+            <w:tcMar>
+              <w:top w:w="80" w:type="dxa"/>
+              <w:bottom w:w="80" w:type="dxa"/>
+              <w:left w:w="120" w:type="dxa"/>
+              <w:right w:w="120" w:type="dxa"/>
+            </w:tcMar>
+          </w:tcPr>
+          <w:p>
+            <w:pPr>
+              <w:jc w:val="left"/>
+            </w:pPr>
+            <w:r>
+              <w:rPr>
+                <w:rFonts w:ascii="Times New Roman" w:hAnsi="Times New Roman"/>
+                <w:sz w:val="20"/>
+              </w:rPr>
+              <w:t>a) [CO] = [Cl₂] = 0,10 M (0,5 đ); b) Kc = 40 (0,5 đ)</w:t>
+            </w:r>
+          </w:p>
+        </w:tc>
+        <w:tc>
+          <w:tcPr>
+            <w:tcW w:type="dxa" w:w="1020"/>
+            <w:tcMar>
+              <w:top w:w="80" w:type="dxa"/>
+              <w:bottom w:w="80" w:type="dxa"/>
+              <w:left w:w="50" w:type="dxa"/>
+              <w:right w:w="50" w:type="dxa"/>
+            </w:tcMar>
+          </w:tcPr>
+          <w:p>
+            <w:pPr>
+              <w:jc w:val="center"/>
+            </w:pPr>
+            <w:r>
+              <w:rPr>
+                <w:rFonts w:ascii="Times New Roman" w:hAnsi="Times New Roman"/>
+                <w:b/>
+                <w:color w:val="C62828"/>
+                <w:sz w:val="20"/>
+              </w:rPr>
+              <w:t>1,0 đ</w:t>
+            </w:r>
+          </w:p>
+        </w:tc>
+      </w:tr>
+      <w:tr>
+        <w:tc>
+          <w:tcPr>
+            <w:tcW w:type="dxa" w:w="1247"/>
+            <w:tcMar>
+              <w:top w:w="80" w:type="dxa"/>
+              <w:bottom w:w="80" w:type="dxa"/>
+              <w:left w:w="100" w:type="dxa"/>
+              <w:right w:w="100" w:type="dxa"/>
+            </w:tcMar>
+          </w:tcPr>
+          <w:p>
+            <w:pPr>
+              <w:jc w:val="center"/>
+            </w:pPr>
+            <w:r>
+              <w:rPr>
+                <w:rFonts w:ascii="Times New Roman" w:hAnsi="Times New Roman"/>
+                <w:b/>
+                <w:sz w:val="20"/>
+              </w:rPr>
+              <w:t>Câu 20</w:t>
+            </w:r>
+          </w:p>
+        </w:tc>
+        <w:tc>
+          <w:tcPr>
+            <w:tcW w:type="dxa" w:w="7937"/>
+            <w:tcMar>
+              <w:top w:w="80" w:type="dxa"/>
+              <w:bottom w:w="80" w:type="dxa"/>
+              <w:left w:w="120" w:type="dxa"/>
+              <w:right w:w="120" w:type="dxa"/>
+            </w:tcMar>
+          </w:tcPr>
+          <w:p>
+            <w:pPr>
+              <w:jc w:val="left"/>
+            </w:pPr>
+            <w:r>
+              <w:rPr>
+                <w:rFonts w:ascii="Times New Roman" w:hAnsi="Times New Roman"/>
+                <w:sz w:val="20"/>
+              </w:rPr>
+              <w:t>a) H⁺ + OH⁻ → H₂O (0,25 đ); b) [OH⁻ dư] = 0,025 M (0,5 đ); pH = 12,40 (0,25 đ)</w:t>
+            </w:r>
+          </w:p>
+        </w:tc>
+        <w:tc>
+          <w:tcPr>
+            <w:tcW w:type="dxa" w:w="1020"/>
+            <w:tcMar>
+              <w:top w:w="80" w:type="dxa"/>
+              <w:bottom w:w="80" w:type="dxa"/>
+              <w:left w:w="50" w:type="dxa"/>
+              <w:right w:w="50" w:type="dxa"/>
+            </w:tcMar>
+          </w:tcPr>
+          <w:p>
+            <w:pPr>
+              <w:jc w:val="center"/>
+            </w:pPr>
+            <w:r>
+              <w:rPr>
+                <w:rFonts w:ascii="Times New Roman" w:hAnsi="Times New Roman"/>
+                <w:b/>
+                <w:color w:val="C62828"/>
+                <w:sz w:val="20"/>
+              </w:rPr>
+              <w:t>1,0 đ</w:t>
+            </w:r>
+          </w:p>
+        </w:tc>
+      </w:tr>
+      <w:tr>
+        <w:tc>
+          <w:tcPr>
+            <w:tcW w:type="dxa" w:w="1247"/>
+            <w:tcMar>
+              <w:top w:w="80" w:type="dxa"/>
+              <w:bottom w:w="80" w:type="dxa"/>
+              <w:left w:w="100" w:type="dxa"/>
+              <w:right w:w="100" w:type="dxa"/>
+            </w:tcMar>
+          </w:tcPr>
+          <w:p>
+            <w:pPr>
+              <w:jc w:val="center"/>
+            </w:pPr>
+            <w:r>
+              <w:rPr>
+                <w:rFonts w:ascii="Times New Roman" w:hAnsi="Times New Roman"/>
+                <w:b/>
+                <w:sz w:val="20"/>
+              </w:rPr>
+              <w:t>Câu 21</w:t>
+            </w:r>
+          </w:p>
+        </w:tc>
+        <w:tc>
+          <w:tcPr>
+            <w:tcW w:type="dxa" w:w="7937"/>
+            <w:tcMar>
+              <w:top w:w="80" w:type="dxa"/>
+              <w:bottom w:w="80" w:type="dxa"/>
+              <w:left w:w="120" w:type="dxa"/>
+              <w:right w:w="120" w:type="dxa"/>
+            </w:tcMar>
+          </w:tcPr>
+          <w:p>
+            <w:pPr>
+              <w:jc w:val="left"/>
+            </w:pPr>
+            <w:r>
+              <w:rPr>
+                <w:rFonts w:ascii="Times New Roman" w:hAnsi="Times New Roman"/>
+                <w:sz w:val="20"/>
+              </w:rPr>
+              <w:t>Nhận biết đúng 3 mẫu (0,5 đ); Viết đúng 2 PTHH (0,5 đ)</w:t>
+            </w:r>
+          </w:p>
+        </w:tc>
+        <w:tc>
+          <w:tcPr>
+            <w:tcW w:type="dxa" w:w="1020"/>
+            <w:tcMar>
+              <w:top w:w="80" w:type="dxa"/>
+              <w:bottom w:w="80" w:type="dxa"/>
+              <w:left w:w="50" w:type="dxa"/>
+              <w:right w:w="50" w:type="dxa"/>
+            </w:tcMar>
+          </w:tcPr>
+          <w:p>
+            <w:pPr>
+              <w:jc w:val="center"/>
+            </w:pPr>
+            <w:r>
+              <w:rPr>
+                <w:rFonts w:ascii="Times New Roman" w:hAnsi="Times New Roman"/>
+                <w:b/>
+                <w:color w:val="C62828"/>
+                <w:sz w:val="20"/>
+              </w:rPr>
+              <w:t>1,0 đ</w:t>
+            </w:r>
+          </w:p>
+        </w:tc>
+      </w:tr>
+    </w:tbl>
     <w:sectPr>
       <w:headerReference w:type="default" r:id="rId9"/>
       <w:footerReference w:type="default" r:id="rId10"/>

</xml_diff>